<commit_message>
Keep pictures from Word files and web pages, and carry them to Seal
Co-Authored-By: Claude Opus 5 <noreply@anthropic.com>
</commit_message>
<xml_diff>
--- a/examples/example-protocol.docx
+++ b/examples/example-protocol.docx
@@ -1,6 +1,6 @@
 
 <file path=word/document.xml><?xml version="1.0" encoding="utf-8"?>
-<w:document xmlns:w="http://schemas.openxmlformats.org/wordprocessingml/2006/main">
+<w:document xmlns:w="http://schemas.openxmlformats.org/wordprocessingml/2006/main" xmlns:r="http://schemas.openxmlformats.org/officeDocument/2006/relationships" xmlns:wp="http://schemas.openxmlformats.org/drawingml/2006/wordprocessingDrawing">
   <w:body>
     <w:p>
       <w:pPr>
@@ -249,6 +249,46 @@
       </w:r>
       <w:r>
         <w:t xml:space="preserve">.</w:t>
+      </w:r>
+    </w:p>
+    <w:p>
+      <w:r>
+        <w:t xml:space="preserve">Gating strategy used on the day:</w:t>
+      </w:r>
+    </w:p>
+    <w:p>
+      <w:r>
+        <w:drawing>
+          <wp:inline distT="0" distB="0" distL="0" distR="0">
+            <wp:extent cx="1080000" cy="720000"/>
+            <wp:docPr id="1" name="photo.png"/>
+            <a:graphic xmlns:a="http://schemas.openxmlformats.org/drawingml/2006/main">
+              <a:graphicData uri="http://schemas.openxmlformats.org/drawingml/2006/picture">
+                <pic:pic xmlns:pic="http://schemas.openxmlformats.org/drawingml/2006/picture">
+                  <pic:nvPicPr>
+                    <pic:cNvPr id="1" name="photo.png"/>
+                    <pic:cNvPicPr/>
+                  </pic:nvPicPr>
+                  <pic:blipFill>
+                    <a:blip r:embed="rId3"/>
+                    <a:stretch>
+                      <a:fillRect/>
+                    </a:stretch>
+                  </pic:blipFill>
+                  <pic:spPr>
+                    <a:xfrm>
+                      <a:off x="0" y="0"/>
+                      <a:ext cx="1080000" cy="720000"/>
+                    </a:xfrm>
+                    <a:prstGeom prst="rect">
+                      <a:avLst/>
+                    </a:prstGeom>
+                  </pic:spPr>
+                </pic:pic>
+              </a:graphicData>
+            </a:graphic>
+          </wp:inline>
+        </w:drawing>
       </w:r>
     </w:p>
   </w:body>

</xml_diff>